<commit_message>
Add US vs Japan institutional comparison to study guide
New section 8 covers side-by-side comparisons:
- SAR vs 疑わしい取引の届出 (thresholds, deadlines, recipients)
- CTR vs 取引時確認 (US has auto-reporting, Japan does not)
- SAR vs CTR differences within US system
- Exam trap patterns (mixing US/Japan rules)
- FIU comparison (FinCEN vs JAFIC)
- Sanctions comparison (OFAC vs 外為法)
- AML program pillars (BSA 5 pillars vs 犯収法/GL)

https://claude.ai/code/session_01UAH8Vfbnfe2YUzgAwoZFTi
</commit_message>
<xml_diff>
--- a/study-notes/CAMS×日本AML_学習ガイド.docx
+++ b/study-notes/CAMS×日本AML_学習ガイド.docx
@@ -1487,6 +1487,1396 @@
         <w:t>💡 Step 1の知識量が最大で、ここが両試験の合否を分ける</w:t>
       </w:r>
     </w:p>
+    <w:p/>
+    <w:p>
+      <w:r>
+        <w:t>━━━━━━━━━━━━━━━━━━━━━━━━━━━━━━━━━━━━━━━━━━━━━━━━━━</w:t>
+      </w:r>
+    </w:p>
+    <w:p>
+      <w:pPr>
+        <w:pStyle w:val="Heading2"/>
+      </w:pPr>
+      <w:r>
+        <w:t>⑧ 米国 vs 日本 — 制度比較（混同注意！）</w:t>
+      </w:r>
+    </w:p>
+    <w:p>
+      <w:r>
+        <w:t>両方勉強しているからこそ混同しやすい。試験ごとに切り替えて答えること。</w:t>
+      </w:r>
+    </w:p>
+    <w:p/>
+    <w:p>
+      <w:pPr>
+        <w:pStyle w:val="Heading3"/>
+      </w:pPr>
+      <w:r>
+        <w:t>疑わしい取引の届出</w:t>
+      </w:r>
+    </w:p>
+    <w:tbl>
+      <w:tblPr>
+        <w:tblStyle w:val="TableGrid"/>
+        <w:tblW w:type="auto" w:w="0"/>
+        <w:tblLook w:firstColumn="1" w:firstRow="1" w:lastColumn="0" w:lastRow="0" w:noHBand="0" w:noVBand="1" w:val="04A0"/>
+      </w:tblPr>
+      <w:tblGrid>
+        <w:gridCol w:w="2880"/>
+        <w:gridCol w:w="2880"/>
+        <w:gridCol w:w="2880"/>
+      </w:tblGrid>
+      <w:tr>
+        <w:tc>
+          <w:tcPr>
+            <w:tcW w:type="dxa" w:w="2880"/>
+          </w:tcPr>
+          <w:p>
+            <w:r>
+              <w:t>項目</w:t>
+            </w:r>
+          </w:p>
+        </w:tc>
+        <w:tc>
+          <w:tcPr>
+            <w:tcW w:type="dxa" w:w="2880"/>
+          </w:tcPr>
+          <w:p>
+            <w:r>
+              <w:t>米国（SAR）</w:t>
+            </w:r>
+          </w:p>
+        </w:tc>
+        <w:tc>
+          <w:tcPr>
+            <w:tcW w:type="dxa" w:w="2880"/>
+          </w:tcPr>
+          <w:p>
+            <w:r>
+              <w:t>日本（疑わしい取引の届出）</w:t>
+            </w:r>
+          </w:p>
+        </w:tc>
+      </w:tr>
+      <w:tr>
+        <w:tc>
+          <w:tcPr>
+            <w:tcW w:type="dxa" w:w="2880"/>
+          </w:tcPr>
+          <w:p>
+            <w:r>
+              <w:t>金額閾値</w:t>
+            </w:r>
+          </w:p>
+        </w:tc>
+        <w:tc>
+          <w:tcPr>
+            <w:tcW w:type="dxa" w:w="2880"/>
+          </w:tcPr>
+          <w:p>
+            <w:r>
+              <w:t>$5,000以上（ML関連）</w:t>
+            </w:r>
+          </w:p>
+        </w:tc>
+        <w:tc>
+          <w:tcPr>
+            <w:tcW w:type="dxa" w:w="2880"/>
+          </w:tcPr>
+          <w:p>
+            <w:r>
+              <w:t>金額基準なし（怪しければ全て）</w:t>
+            </w:r>
+          </w:p>
+        </w:tc>
+      </w:tr>
+      <w:tr>
+        <w:tc>
+          <w:tcPr>
+            <w:tcW w:type="dxa" w:w="2880"/>
+          </w:tcPr>
+          <w:p>
+            <w:r>
+              <w:t>提出期限</w:t>
+            </w:r>
+          </w:p>
+        </w:tc>
+        <w:tc>
+          <w:tcPr>
+            <w:tcW w:type="dxa" w:w="2880"/>
+          </w:tcPr>
+          <w:p>
+            <w:r>
+              <w:t>30日（最大60日）</w:t>
+            </w:r>
+          </w:p>
+        </w:tc>
+        <w:tc>
+          <w:tcPr>
+            <w:tcW w:type="dxa" w:w="2880"/>
+          </w:tcPr>
+          <w:p>
+            <w:r>
+              <w:t>速やかに</w:t>
+            </w:r>
+          </w:p>
+        </w:tc>
+      </w:tr>
+      <w:tr>
+        <w:tc>
+          <w:tcPr>
+            <w:tcW w:type="dxa" w:w="2880"/>
+          </w:tcPr>
+          <w:p>
+            <w:r>
+              <w:t>届出先</w:t>
+            </w:r>
+          </w:p>
+        </w:tc>
+        <w:tc>
+          <w:tcPr>
+            <w:tcW w:type="dxa" w:w="2880"/>
+          </w:tcPr>
+          <w:p>
+            <w:r>
+              <w:t>FinCEN</w:t>
+            </w:r>
+          </w:p>
+        </w:tc>
+        <w:tc>
+          <w:tcPr>
+            <w:tcW w:type="dxa" w:w="2880"/>
+          </w:tcPr>
+          <w:p>
+            <w:r>
+              <w:t>JAFIC（所管行政庁経由）</w:t>
+            </w:r>
+          </w:p>
+        </w:tc>
+      </w:tr>
+      <w:tr>
+        <w:tc>
+          <w:tcPr>
+            <w:tcW w:type="dxa" w:w="2880"/>
+          </w:tcPr>
+          <w:p>
+            <w:r>
+              <w:t>Tipping-off禁止</w:t>
+            </w:r>
+          </w:p>
+        </w:tc>
+        <w:tc>
+          <w:tcPr>
+            <w:tcW w:type="dxa" w:w="2880"/>
+          </w:tcPr>
+          <w:p>
+            <w:r>
+              <w:t>あり</w:t>
+            </w:r>
+          </w:p>
+        </w:tc>
+        <w:tc>
+          <w:tcPr>
+            <w:tcW w:type="dxa" w:w="2880"/>
+          </w:tcPr>
+          <w:p>
+            <w:r>
+              <w:t>あり（同じ）</w:t>
+            </w:r>
+          </w:p>
+        </w:tc>
+      </w:tr>
+      <w:tr>
+        <w:tc>
+          <w:tcPr>
+            <w:tcW w:type="dxa" w:w="2880"/>
+          </w:tcPr>
+          <w:p>
+            <w:r>
+              <w:t>免責（Safe Harbor）</w:t>
+            </w:r>
+          </w:p>
+        </w:tc>
+        <w:tc>
+          <w:tcPr>
+            <w:tcW w:type="dxa" w:w="2880"/>
+          </w:tcPr>
+          <w:p>
+            <w:r>
+              <w:t>あり</w:t>
+            </w:r>
+          </w:p>
+        </w:tc>
+        <w:tc>
+          <w:tcPr>
+            <w:tcW w:type="dxa" w:w="2880"/>
+          </w:tcPr>
+          <w:p>
+            <w:r>
+              <w:t>あり（同じ）</w:t>
+            </w:r>
+          </w:p>
+        </w:tc>
+      </w:tr>
+      <w:tr>
+        <w:tc>
+          <w:tcPr>
+            <w:tcW w:type="dxa" w:w="2880"/>
+          </w:tcPr>
+          <w:p>
+            <w:r>
+              <w:t>根拠法</w:t>
+            </w:r>
+          </w:p>
+        </w:tc>
+        <w:tc>
+          <w:tcPr>
+            <w:tcW w:type="dxa" w:w="2880"/>
+          </w:tcPr>
+          <w:p>
+            <w:r>
+              <w:t>31 CFR 1020.320</w:t>
+            </w:r>
+          </w:p>
+        </w:tc>
+        <w:tc>
+          <w:tcPr>
+            <w:tcW w:type="dxa" w:w="2880"/>
+          </w:tcPr>
+          <w:p>
+            <w:r>
+              <w:t>犯収法第8条</w:t>
+            </w:r>
+          </w:p>
+        </w:tc>
+      </w:tr>
+    </w:tbl>
+    <w:p/>
+    <w:p>
+      <w:pPr>
+        <w:pStyle w:val="Heading3"/>
+      </w:pPr>
+      <w:r>
+        <w:t>大口現金取引の扱い</w:t>
+      </w:r>
+    </w:p>
+    <w:tbl>
+      <w:tblPr>
+        <w:tblStyle w:val="TableGrid"/>
+        <w:tblW w:type="auto" w:w="0"/>
+        <w:tblLook w:firstColumn="1" w:firstRow="1" w:lastColumn="0" w:lastRow="0" w:noHBand="0" w:noVBand="1" w:val="04A0"/>
+      </w:tblPr>
+      <w:tblGrid>
+        <w:gridCol w:w="2880"/>
+        <w:gridCol w:w="2880"/>
+        <w:gridCol w:w="2880"/>
+      </w:tblGrid>
+      <w:tr>
+        <w:tc>
+          <w:tcPr>
+            <w:tcW w:type="dxa" w:w="2880"/>
+          </w:tcPr>
+          <w:p>
+            <w:r>
+              <w:t>項目</w:t>
+            </w:r>
+          </w:p>
+        </w:tc>
+        <w:tc>
+          <w:tcPr>
+            <w:tcW w:type="dxa" w:w="2880"/>
+          </w:tcPr>
+          <w:p>
+            <w:r>
+              <w:t>米国（CTR）</w:t>
+            </w:r>
+          </w:p>
+        </w:tc>
+        <w:tc>
+          <w:tcPr>
+            <w:tcW w:type="dxa" w:w="2880"/>
+          </w:tcPr>
+          <w:p>
+            <w:r>
+              <w:t>日本</w:t>
+            </w:r>
+          </w:p>
+        </w:tc>
+      </w:tr>
+      <w:tr>
+        <w:tc>
+          <w:tcPr>
+            <w:tcW w:type="dxa" w:w="2880"/>
+          </w:tcPr>
+          <w:p>
+            <w:r>
+              <w:t>制度</w:t>
+            </w:r>
+          </w:p>
+        </w:tc>
+        <w:tc>
+          <w:tcPr>
+            <w:tcW w:type="dxa" w:w="2880"/>
+          </w:tcPr>
+          <w:p>
+            <w:r>
+              <w:t>大口現金 → 自動報告</w:t>
+            </w:r>
+          </w:p>
+        </w:tc>
+        <w:tc>
+          <w:tcPr>
+            <w:tcW w:type="dxa" w:w="2880"/>
+          </w:tcPr>
+          <w:p>
+            <w:r>
+              <w:t>大口現金 → 取引時確認（報告ではない）</w:t>
+            </w:r>
+          </w:p>
+        </w:tc>
+      </w:tr>
+      <w:tr>
+        <w:tc>
+          <w:tcPr>
+            <w:tcW w:type="dxa" w:w="2880"/>
+          </w:tcPr>
+          <w:p>
+            <w:r>
+              <w:t>閾値</w:t>
+            </w:r>
+          </w:p>
+        </w:tc>
+        <w:tc>
+          <w:tcPr>
+            <w:tcW w:type="dxa" w:w="2880"/>
+          </w:tcPr>
+          <w:p>
+            <w:r>
+              <w:t>$10,000超</w:t>
+            </w:r>
+          </w:p>
+        </w:tc>
+        <w:tc>
+          <w:tcPr>
+            <w:tcW w:type="dxa" w:w="2880"/>
+          </w:tcPr>
+          <w:p>
+            <w:r>
+              <w:t>200万円超</w:t>
+            </w:r>
+          </w:p>
+        </w:tc>
+      </w:tr>
+      <w:tr>
+        <w:tc>
+          <w:tcPr>
+            <w:tcW w:type="dxa" w:w="2880"/>
+          </w:tcPr>
+          <w:p>
+            <w:r>
+              <w:t>やること</w:t>
+            </w:r>
+          </w:p>
+        </w:tc>
+        <w:tc>
+          <w:tcPr>
+            <w:tcW w:type="dxa" w:w="2880"/>
+          </w:tcPr>
+          <w:p>
+            <w:r>
+              <w:t>FinCENに報告書を提出</w:t>
+            </w:r>
+          </w:p>
+        </w:tc>
+        <w:tc>
+          <w:tcPr>
+            <w:tcW w:type="dxa" w:w="2880"/>
+          </w:tcPr>
+          <w:p>
+            <w:r>
+              <w:t>本人確認を実施</w:t>
+            </w:r>
+          </w:p>
+        </w:tc>
+      </w:tr>
+      <w:tr>
+        <w:tc>
+          <w:tcPr>
+            <w:tcW w:type="dxa" w:w="2880"/>
+          </w:tcPr>
+          <w:p>
+            <w:r>
+              <w:t>顧客に知らせる</w:t>
+            </w:r>
+          </w:p>
+        </w:tc>
+        <w:tc>
+          <w:tcPr>
+            <w:tcW w:type="dxa" w:w="2880"/>
+          </w:tcPr>
+          <w:p>
+            <w:r>
+              <w:t>OK（秘密ではない）</w:t>
+            </w:r>
+          </w:p>
+        </w:tc>
+        <w:tc>
+          <w:tcPr>
+            <w:tcW w:type="dxa" w:w="2880"/>
+          </w:tcPr>
+          <w:p>
+            <w:r>
+              <w:t>—</w:t>
+            </w:r>
+          </w:p>
+        </w:tc>
+      </w:tr>
+    </w:tbl>
+    <w:p/>
+    <w:p>
+      <w:r>
+        <w:t>重要: 日本にはCTR（大口現金の自動報告）に相当する制度がない</w:t>
+      </w:r>
+    </w:p>
+    <w:p/>
+    <w:p>
+      <w:pPr>
+        <w:pStyle w:val="Heading3"/>
+      </w:pPr>
+      <w:r>
+        <w:t>SAR vs CTR（米国内での違い）</w:t>
+      </w:r>
+    </w:p>
+    <w:tbl>
+      <w:tblPr>
+        <w:tblStyle w:val="TableGrid"/>
+        <w:tblW w:type="auto" w:w="0"/>
+        <w:tblLook w:firstColumn="1" w:firstRow="1" w:lastColumn="0" w:lastRow="0" w:noHBand="0" w:noVBand="1" w:val="04A0"/>
+      </w:tblPr>
+      <w:tblGrid>
+        <w:gridCol w:w="2880"/>
+        <w:gridCol w:w="2880"/>
+        <w:gridCol w:w="2880"/>
+      </w:tblGrid>
+      <w:tr>
+        <w:tc>
+          <w:tcPr>
+            <w:tcW w:type="dxa" w:w="2880"/>
+          </w:tcPr>
+          <w:p>
+            <w:r/>
+          </w:p>
+        </w:tc>
+        <w:tc>
+          <w:tcPr>
+            <w:tcW w:type="dxa" w:w="2880"/>
+          </w:tcPr>
+          <w:p>
+            <w:r>
+              <w:t>SAR</w:t>
+            </w:r>
+          </w:p>
+        </w:tc>
+        <w:tc>
+          <w:tcPr>
+            <w:tcW w:type="dxa" w:w="2880"/>
+          </w:tcPr>
+          <w:p>
+            <w:r>
+              <w:t>CTR</w:t>
+            </w:r>
+          </w:p>
+        </w:tc>
+      </w:tr>
+      <w:tr>
+        <w:tc>
+          <w:tcPr>
+            <w:tcW w:type="dxa" w:w="2880"/>
+          </w:tcPr>
+          <w:p>
+            <w:r>
+              <w:t>正式名</w:t>
+            </w:r>
+          </w:p>
+        </w:tc>
+        <w:tc>
+          <w:tcPr>
+            <w:tcW w:type="dxa" w:w="2880"/>
+          </w:tcPr>
+          <w:p>
+            <w:r>
+              <w:t>Suspicious Activity Report</w:t>
+            </w:r>
+          </w:p>
+        </w:tc>
+        <w:tc>
+          <w:tcPr>
+            <w:tcW w:type="dxa" w:w="2880"/>
+          </w:tcPr>
+          <w:p>
+            <w:r>
+              <w:t>Currency Transaction Report</w:t>
+            </w:r>
+          </w:p>
+        </w:tc>
+      </w:tr>
+      <w:tr>
+        <w:tc>
+          <w:tcPr>
+            <w:tcW w:type="dxa" w:w="2880"/>
+          </w:tcPr>
+          <w:p>
+            <w:r>
+              <w:t>いつ出す</w:t>
+            </w:r>
+          </w:p>
+        </w:tc>
+        <w:tc>
+          <w:tcPr>
+            <w:tcW w:type="dxa" w:w="2880"/>
+          </w:tcPr>
+          <w:p>
+            <w:r>
+              <w:t>怪しい取引を検知したとき</w:t>
+            </w:r>
+          </w:p>
+        </w:tc>
+        <w:tc>
+          <w:tcPr>
+            <w:tcW w:type="dxa" w:w="2880"/>
+          </w:tcPr>
+          <w:p>
+            <w:r>
+              <w:t>$10,000超の現金取引があったとき</w:t>
+            </w:r>
+          </w:p>
+        </w:tc>
+      </w:tr>
+      <w:tr>
+        <w:tc>
+          <w:tcPr>
+            <w:tcW w:type="dxa" w:w="2880"/>
+          </w:tcPr>
+          <w:p>
+            <w:r>
+              <w:t>判断</w:t>
+            </w:r>
+          </w:p>
+        </w:tc>
+        <w:tc>
+          <w:tcPr>
+            <w:tcW w:type="dxa" w:w="2880"/>
+          </w:tcPr>
+          <w:p>
+            <w:r>
+              <w:t>銀行員の判断が必要</w:t>
+            </w:r>
+          </w:p>
+        </w:tc>
+        <w:tc>
+          <w:tcPr>
+            <w:tcW w:type="dxa" w:w="2880"/>
+          </w:tcPr>
+          <w:p>
+            <w:r>
+              <w:t>自動的（金額で機械的に決まる）</w:t>
+            </w:r>
+          </w:p>
+        </w:tc>
+      </w:tr>
+      <w:tr>
+        <w:tc>
+          <w:tcPr>
+            <w:tcW w:type="dxa" w:w="2880"/>
+          </w:tcPr>
+          <w:p>
+            <w:r>
+              <w:t>閾値</w:t>
+            </w:r>
+          </w:p>
+        </w:tc>
+        <w:tc>
+          <w:tcPr>
+            <w:tcW w:type="dxa" w:w="2880"/>
+          </w:tcPr>
+          <w:p>
+            <w:r>
+              <w:t>$5,000以上（ML関連）</w:t>
+            </w:r>
+          </w:p>
+        </w:tc>
+        <w:tc>
+          <w:tcPr>
+            <w:tcW w:type="dxa" w:w="2880"/>
+          </w:tcPr>
+          <w:p>
+            <w:r>
+              <w:t>$10,000超</w:t>
+            </w:r>
+          </w:p>
+        </w:tc>
+      </w:tr>
+      <w:tr>
+        <w:tc>
+          <w:tcPr>
+            <w:tcW w:type="dxa" w:w="2880"/>
+          </w:tcPr>
+          <w:p>
+            <w:r>
+              <w:t>顧客に伝える</w:t>
+            </w:r>
+          </w:p>
+        </w:tc>
+        <w:tc>
+          <w:tcPr>
+            <w:tcW w:type="dxa" w:w="2880"/>
+          </w:tcPr>
+          <w:p>
+            <w:r>
+              <w:t>絶対ダメ（Tipping-off）</w:t>
+            </w:r>
+          </w:p>
+        </w:tc>
+        <w:tc>
+          <w:tcPr>
+            <w:tcW w:type="dxa" w:w="2880"/>
+          </w:tcPr>
+          <w:p>
+            <w:r>
+              <w:t>知られてもOK</w:t>
+            </w:r>
+          </w:p>
+        </w:tc>
+      </w:tr>
+    </w:tbl>
+    <w:p/>
+    <w:p>
+      <w:pPr>
+        <w:pStyle w:val="Heading3"/>
+      </w:pPr>
+      <w:r>
+        <w:t>制度の全体像</w:t>
+      </w:r>
+    </w:p>
+    <w:p>
+      <w:r>
+        <w:t>米国 = 2本立て（SAR + CTR）= 数字が多い</w:t>
+      </w:r>
+    </w:p>
+    <w:p>
+      <w:r>
+        <w:t>日本 = 1本（疑わしい取引の届出）= シンプル</w:t>
+      </w:r>
+    </w:p>
+    <w:p/>
+    <w:p>
+      <w:pPr>
+        <w:pStyle w:val="Heading3"/>
+      </w:pPr>
+      <w:r>
+        <w:t>試験での引っ掛けパターン（要注意！）</w:t>
+      </w:r>
+    </w:p>
+    <w:p>
+      <w:r>
+        <w:t>■ CAMS試験での罠:</w:t>
+      </w:r>
+    </w:p>
+    <w:p>
+      <w:r>
+        <w:t xml:space="preserve">  ❌ $50,000 ← ゼロ1個多い</w:t>
+      </w:r>
+    </w:p>
+    <w:p>
+      <w:r>
+        <w:t xml:space="preserve">  ❌ 金額基準なし ← 日本の知識で答えてしまう</w:t>
+      </w:r>
+    </w:p>
+    <w:p>
+      <w:r>
+        <w:t xml:space="preserve">  ✅ $5,000（ML関連SAR）</w:t>
+      </w:r>
+    </w:p>
+    <w:p/>
+    <w:p>
+      <w:r>
+        <w:t>■ 日本AML試験での罠:</w:t>
+      </w:r>
+    </w:p>
+    <w:p>
+      <w:r>
+        <w:t xml:space="preserve">  ❌ $5,000以上 ← CAMSの知識で答えてしまう</w:t>
+      </w:r>
+    </w:p>
+    <w:p>
+      <w:r>
+        <w:t xml:space="preserve">  ❌ 200万円以上 ← 取引時確認の閾値と混同</w:t>
+      </w:r>
+    </w:p>
+    <w:p>
+      <w:r>
+        <w:t xml:space="preserve">  ✅ 金額基準なし</w:t>
+      </w:r>
+    </w:p>
+    <w:p/>
+    <w:p>
+      <w:r>
+        <w:t>覚え方:</w:t>
+      </w:r>
+    </w:p>
+    <w:p>
+      <w:r>
+        <w:t xml:space="preserve">  CAMS受験中 → 米国の数字で答える（$5,000 / $10,000 / 30日 / 60日）</w:t>
+      </w:r>
+    </w:p>
+    <w:p>
+      <w:r>
+        <w:t xml:space="preserve">  日本AML受験中 → 日本のルールで答える（金額基準なし / 速やかに / 200万円超は取引時確認）</w:t>
+      </w:r>
+    </w:p>
+    <w:p/>
+    <w:p>
+      <w:pPr>
+        <w:pStyle w:val="Heading3"/>
+      </w:pPr>
+      <w:r>
+        <w:t>FIU（資金情報機関）の比較</w:t>
+      </w:r>
+    </w:p>
+    <w:tbl>
+      <w:tblPr>
+        <w:tblStyle w:val="TableGrid"/>
+        <w:tblW w:type="auto" w:w="0"/>
+        <w:tblLook w:firstColumn="1" w:firstRow="1" w:lastColumn="0" w:lastRow="0" w:noHBand="0" w:noVBand="1" w:val="04A0"/>
+      </w:tblPr>
+      <w:tblGrid>
+        <w:gridCol w:w="2880"/>
+        <w:gridCol w:w="2880"/>
+        <w:gridCol w:w="2880"/>
+      </w:tblGrid>
+      <w:tr>
+        <w:tc>
+          <w:tcPr>
+            <w:tcW w:type="dxa" w:w="2880"/>
+          </w:tcPr>
+          <w:p>
+            <w:r>
+              <w:t>項目</w:t>
+            </w:r>
+          </w:p>
+        </w:tc>
+        <w:tc>
+          <w:tcPr>
+            <w:tcW w:type="dxa" w:w="2880"/>
+          </w:tcPr>
+          <w:p>
+            <w:r>
+              <w:t>米国</w:t>
+            </w:r>
+          </w:p>
+        </w:tc>
+        <w:tc>
+          <w:tcPr>
+            <w:tcW w:type="dxa" w:w="2880"/>
+          </w:tcPr>
+          <w:p>
+            <w:r>
+              <w:t>日本</w:t>
+            </w:r>
+          </w:p>
+        </w:tc>
+      </w:tr>
+      <w:tr>
+        <w:tc>
+          <w:tcPr>
+            <w:tcW w:type="dxa" w:w="2880"/>
+          </w:tcPr>
+          <w:p>
+            <w:r>
+              <w:t>名称</w:t>
+            </w:r>
+          </w:p>
+        </w:tc>
+        <w:tc>
+          <w:tcPr>
+            <w:tcW w:type="dxa" w:w="2880"/>
+          </w:tcPr>
+          <w:p>
+            <w:r>
+              <w:t>FinCEN</w:t>
+            </w:r>
+          </w:p>
+        </w:tc>
+        <w:tc>
+          <w:tcPr>
+            <w:tcW w:type="dxa" w:w="2880"/>
+          </w:tcPr>
+          <w:p>
+            <w:r>
+              <w:t>JAFIC</w:t>
+            </w:r>
+          </w:p>
+        </w:tc>
+      </w:tr>
+      <w:tr>
+        <w:tc>
+          <w:tcPr>
+            <w:tcW w:type="dxa" w:w="2880"/>
+          </w:tcPr>
+          <w:p>
+            <w:r>
+              <w:t>正式名</w:t>
+            </w:r>
+          </w:p>
+        </w:tc>
+        <w:tc>
+          <w:tcPr>
+            <w:tcW w:type="dxa" w:w="2880"/>
+          </w:tcPr>
+          <w:p>
+            <w:r>
+              <w:t>Financial Crimes Enforcement Network</w:t>
+            </w:r>
+          </w:p>
+        </w:tc>
+        <w:tc>
+          <w:tcPr>
+            <w:tcW w:type="dxa" w:w="2880"/>
+          </w:tcPr>
+          <w:p>
+            <w:r>
+              <w:t>犯罪収益移転防止対策室</w:t>
+            </w:r>
+          </w:p>
+        </w:tc>
+      </w:tr>
+      <w:tr>
+        <w:tc>
+          <w:tcPr>
+            <w:tcW w:type="dxa" w:w="2880"/>
+          </w:tcPr>
+          <w:p>
+            <w:r>
+              <w:t>所属</w:t>
+            </w:r>
+          </w:p>
+        </w:tc>
+        <w:tc>
+          <w:tcPr>
+            <w:tcW w:type="dxa" w:w="2880"/>
+          </w:tcPr>
+          <w:p>
+            <w:r>
+              <w:t>財務省</w:t>
+            </w:r>
+          </w:p>
+        </w:tc>
+        <w:tc>
+          <w:tcPr>
+            <w:tcW w:type="dxa" w:w="2880"/>
+          </w:tcPr>
+          <w:p>
+            <w:r>
+              <w:t>警察庁（国家公安委員会）</w:t>
+            </w:r>
+          </w:p>
+        </w:tc>
+      </w:tr>
+      <w:tr>
+        <w:tc>
+          <w:tcPr>
+            <w:tcW w:type="dxa" w:w="2880"/>
+          </w:tcPr>
+          <w:p>
+            <w:r>
+              <w:t>機能</w:t>
+            </w:r>
+          </w:p>
+        </w:tc>
+        <w:tc>
+          <w:tcPr>
+            <w:tcW w:type="dxa" w:w="2880"/>
+          </w:tcPr>
+          <w:p>
+            <w:r>
+              <w:t>SAR/CTRの受領・分析・提供</w:t>
+            </w:r>
+          </w:p>
+        </w:tc>
+        <w:tc>
+          <w:tcPr>
+            <w:tcW w:type="dxa" w:w="2880"/>
+          </w:tcPr>
+          <w:p>
+            <w:r>
+              <w:t>疑わしい取引届出の受領・分析・提供</w:t>
+            </w:r>
+          </w:p>
+        </w:tc>
+      </w:tr>
+      <w:tr>
+        <w:tc>
+          <w:tcPr>
+            <w:tcW w:type="dxa" w:w="2880"/>
+          </w:tcPr>
+          <w:p>
+            <w:r>
+              <w:t>国際連携</w:t>
+            </w:r>
+          </w:p>
+        </w:tc>
+        <w:tc>
+          <w:tcPr>
+            <w:tcW w:type="dxa" w:w="2880"/>
+          </w:tcPr>
+          <w:p>
+            <w:r>
+              <w:t>Egmont Group加盟</w:t>
+            </w:r>
+          </w:p>
+        </w:tc>
+        <w:tc>
+          <w:tcPr>
+            <w:tcW w:type="dxa" w:w="2880"/>
+          </w:tcPr>
+          <w:p>
+            <w:r>
+              <w:t>Egmont Group加盟（同じ）</w:t>
+            </w:r>
+          </w:p>
+        </w:tc>
+      </w:tr>
+    </w:tbl>
+    <w:p/>
+    <w:p>
+      <w:pPr>
+        <w:pStyle w:val="Heading3"/>
+      </w:pPr>
+      <w:r>
+        <w:t>制裁（資産凍結）の比較</w:t>
+      </w:r>
+    </w:p>
+    <w:tbl>
+      <w:tblPr>
+        <w:tblStyle w:val="TableGrid"/>
+        <w:tblW w:type="auto" w:w="0"/>
+        <w:tblLook w:firstColumn="1" w:firstRow="1" w:lastColumn="0" w:lastRow="0" w:noHBand="0" w:noVBand="1" w:val="04A0"/>
+      </w:tblPr>
+      <w:tblGrid>
+        <w:gridCol w:w="2880"/>
+        <w:gridCol w:w="2880"/>
+        <w:gridCol w:w="2880"/>
+      </w:tblGrid>
+      <w:tr>
+        <w:tc>
+          <w:tcPr>
+            <w:tcW w:type="dxa" w:w="2880"/>
+          </w:tcPr>
+          <w:p>
+            <w:r>
+              <w:t>項目</w:t>
+            </w:r>
+          </w:p>
+        </w:tc>
+        <w:tc>
+          <w:tcPr>
+            <w:tcW w:type="dxa" w:w="2880"/>
+          </w:tcPr>
+          <w:p>
+            <w:r>
+              <w:t>米国</w:t>
+            </w:r>
+          </w:p>
+        </w:tc>
+        <w:tc>
+          <w:tcPr>
+            <w:tcW w:type="dxa" w:w="2880"/>
+          </w:tcPr>
+          <w:p>
+            <w:r>
+              <w:t>日本</w:t>
+            </w:r>
+          </w:p>
+        </w:tc>
+      </w:tr>
+      <w:tr>
+        <w:tc>
+          <w:tcPr>
+            <w:tcW w:type="dxa" w:w="2880"/>
+          </w:tcPr>
+          <w:p>
+            <w:r>
+              <w:t>実施機関</w:t>
+            </w:r>
+          </w:p>
+        </w:tc>
+        <w:tc>
+          <w:tcPr>
+            <w:tcW w:type="dxa" w:w="2880"/>
+          </w:tcPr>
+          <w:p>
+            <w:r>
+              <w:t>OFAC（財務省）</w:t>
+            </w:r>
+          </w:p>
+        </w:tc>
+        <w:tc>
+          <w:tcPr>
+            <w:tcW w:type="dxa" w:w="2880"/>
+          </w:tcPr>
+          <w:p>
+            <w:r>
+              <w:t>財務省・外務省</w:t>
+            </w:r>
+          </w:p>
+        </w:tc>
+      </w:tr>
+      <w:tr>
+        <w:tc>
+          <w:tcPr>
+            <w:tcW w:type="dxa" w:w="2880"/>
+          </w:tcPr>
+          <w:p>
+            <w:r>
+              <w:t>根拠法</w:t>
+            </w:r>
+          </w:p>
+        </w:tc>
+        <w:tc>
+          <w:tcPr>
+            <w:tcW w:type="dxa" w:w="2880"/>
+          </w:tcPr>
+          <w:p>
+            <w:r>
+              <w:t>IEEPA、TWEA等</w:t>
+            </w:r>
+          </w:p>
+        </w:tc>
+        <w:tc>
+          <w:tcPr>
+            <w:tcW w:type="dxa" w:w="2880"/>
+          </w:tcPr>
+          <w:p>
+            <w:r>
+              <w:t>外為法</w:t>
+            </w:r>
+          </w:p>
+        </w:tc>
+      </w:tr>
+      <w:tr>
+        <w:tc>
+          <w:tcPr>
+            <w:tcW w:type="dxa" w:w="2880"/>
+          </w:tcPr>
+          <w:p>
+            <w:r>
+              <w:t>リスト</w:t>
+            </w:r>
+          </w:p>
+        </w:tc>
+        <w:tc>
+          <w:tcPr>
+            <w:tcW w:type="dxa" w:w="2880"/>
+          </w:tcPr>
+          <w:p>
+            <w:r>
+              <w:t>SDNリスト（約1万件）</w:t>
+            </w:r>
+          </w:p>
+        </w:tc>
+        <w:tc>
+          <w:tcPr>
+            <w:tcW w:type="dxa" w:w="2880"/>
+          </w:tcPr>
+          <w:p>
+            <w:r>
+              <w:t>外為法に基づく資産凍結リスト</w:t>
+            </w:r>
+          </w:p>
+        </w:tc>
+      </w:tr>
+      <w:tr>
+        <w:tc>
+          <w:tcPr>
+            <w:tcW w:type="dxa" w:w="2880"/>
+          </w:tcPr>
+          <w:p>
+            <w:r>
+              <w:t>50%ルール</w:t>
+            </w:r>
+          </w:p>
+        </w:tc>
+        <w:tc>
+          <w:tcPr>
+            <w:tcW w:type="dxa" w:w="2880"/>
+          </w:tcPr>
+          <w:p>
+            <w:r>
+              <w:t>あり（SDNが50%超保有→自動制裁）</w:t>
+            </w:r>
+          </w:p>
+        </w:tc>
+        <w:tc>
+          <w:tcPr>
+            <w:tcW w:type="dxa" w:w="2880"/>
+          </w:tcPr>
+          <w:p>
+            <w:r>
+              <w:t>なし</w:t>
+            </w:r>
+          </w:p>
+        </w:tc>
+      </w:tr>
+    </w:tbl>
+    <w:p/>
+    <w:p>
+      <w:pPr>
+        <w:pStyle w:val="Heading3"/>
+      </w:pPr>
+      <w:r>
+        <w:t>AMLプログラムの柱</w:t>
+      </w:r>
+    </w:p>
+    <w:tbl>
+      <w:tblPr>
+        <w:tblStyle w:val="TableGrid"/>
+        <w:tblW w:type="auto" w:w="0"/>
+        <w:tblLook w:firstColumn="1" w:firstRow="1" w:lastColumn="0" w:lastRow="0" w:noHBand="0" w:noVBand="1" w:val="04A0"/>
+      </w:tblPr>
+      <w:tblGrid>
+        <w:gridCol w:w="2880"/>
+        <w:gridCol w:w="2880"/>
+        <w:gridCol w:w="2880"/>
+      </w:tblGrid>
+      <w:tr>
+        <w:tc>
+          <w:tcPr>
+            <w:tcW w:type="dxa" w:w="2880"/>
+          </w:tcPr>
+          <w:p>
+            <w:r/>
+          </w:p>
+        </w:tc>
+        <w:tc>
+          <w:tcPr>
+            <w:tcW w:type="dxa" w:w="2880"/>
+          </w:tcPr>
+          <w:p>
+            <w:r>
+              <w:t>米国（BSA）</w:t>
+            </w:r>
+          </w:p>
+        </w:tc>
+        <w:tc>
+          <w:tcPr>
+            <w:tcW w:type="dxa" w:w="2880"/>
+          </w:tcPr>
+          <w:p>
+            <w:r>
+              <w:t>日本（犯収法/金融庁GL）</w:t>
+            </w:r>
+          </w:p>
+        </w:tc>
+      </w:tr>
+      <w:tr>
+        <w:tc>
+          <w:tcPr>
+            <w:tcW w:type="dxa" w:w="2880"/>
+          </w:tcPr>
+          <w:p>
+            <w:r>
+              <w:t>第1の柱</w:t>
+            </w:r>
+          </w:p>
+        </w:tc>
+        <w:tc>
+          <w:tcPr>
+            <w:tcW w:type="dxa" w:w="2880"/>
+          </w:tcPr>
+          <w:p>
+            <w:r>
+              <w:t>内部統制（Policies）</w:t>
+            </w:r>
+          </w:p>
+        </w:tc>
+        <w:tc>
+          <w:tcPr>
+            <w:tcW w:type="dxa" w:w="2880"/>
+          </w:tcPr>
+          <w:p>
+            <w:r>
+              <w:t>方針・手続・計画の策定</w:t>
+            </w:r>
+          </w:p>
+        </w:tc>
+      </w:tr>
+      <w:tr>
+        <w:tc>
+          <w:tcPr>
+            <w:tcW w:type="dxa" w:w="2880"/>
+          </w:tcPr>
+          <w:p>
+            <w:r>
+              <w:t>第2の柱</w:t>
+            </w:r>
+          </w:p>
+        </w:tc>
+        <w:tc>
+          <w:tcPr>
+            <w:tcW w:type="dxa" w:w="2880"/>
+          </w:tcPr>
+          <w:p>
+            <w:r>
+              <w:t>BSAコンプライアンス・オフィサー</w:t>
+            </w:r>
+          </w:p>
+        </w:tc>
+        <w:tc>
+          <w:tcPr>
+            <w:tcW w:type="dxa" w:w="2880"/>
+          </w:tcPr>
+          <w:p>
+            <w:r>
+              <w:t>統括管理者の選任</w:t>
+            </w:r>
+          </w:p>
+        </w:tc>
+      </w:tr>
+      <w:tr>
+        <w:tc>
+          <w:tcPr>
+            <w:tcW w:type="dxa" w:w="2880"/>
+          </w:tcPr>
+          <w:p>
+            <w:r>
+              <w:t>第3の柱</w:t>
+            </w:r>
+          </w:p>
+        </w:tc>
+        <w:tc>
+          <w:tcPr>
+            <w:tcW w:type="dxa" w:w="2880"/>
+          </w:tcPr>
+          <w:p>
+            <w:r>
+              <w:t>研修（Training）</w:t>
+            </w:r>
+          </w:p>
+        </w:tc>
+        <w:tc>
+          <w:tcPr>
+            <w:tcW w:type="dxa" w:w="2880"/>
+          </w:tcPr>
+          <w:p>
+            <w:r>
+              <w:t>研修の実施</w:t>
+            </w:r>
+          </w:p>
+        </w:tc>
+      </w:tr>
+      <w:tr>
+        <w:tc>
+          <w:tcPr>
+            <w:tcW w:type="dxa" w:w="2880"/>
+          </w:tcPr>
+          <w:p>
+            <w:r>
+              <w:t>第4の柱</w:t>
+            </w:r>
+          </w:p>
+        </w:tc>
+        <w:tc>
+          <w:tcPr>
+            <w:tcW w:type="dxa" w:w="2880"/>
+          </w:tcPr>
+          <w:p>
+            <w:r>
+              <w:t>独立監査（Independent Testing）</w:t>
+            </w:r>
+          </w:p>
+        </w:tc>
+        <w:tc>
+          <w:tcPr>
+            <w:tcW w:type="dxa" w:w="2880"/>
+          </w:tcPr>
+          <w:p>
+            <w:r>
+              <w:t>内部監査</w:t>
+            </w:r>
+          </w:p>
+        </w:tc>
+      </w:tr>
+      <w:tr>
+        <w:tc>
+          <w:tcPr>
+            <w:tcW w:type="dxa" w:w="2880"/>
+          </w:tcPr>
+          <w:p>
+            <w:r>
+              <w:t>第5の柱</w:t>
+            </w:r>
+          </w:p>
+        </w:tc>
+        <w:tc>
+          <w:tcPr>
+            <w:tcW w:type="dxa" w:w="2880"/>
+          </w:tcPr>
+          <w:p>
+            <w:r>
+              <w:t>継続的CDD（2018年追加）</w:t>
+            </w:r>
+          </w:p>
+        </w:tc>
+        <w:tc>
+          <w:tcPr>
+            <w:tcW w:type="dxa" w:w="2880"/>
+          </w:tcPr>
+          <w:p>
+            <w:r>
+              <w:t>継続的顧客管理（金融庁GL）</w:t>
+            </w:r>
+          </w:p>
+        </w:tc>
+      </w:tr>
+      <w:tr>
+        <w:tc>
+          <w:tcPr>
+            <w:tcW w:type="dxa" w:w="2880"/>
+          </w:tcPr>
+          <w:p>
+            <w:r>
+              <w:t>3線管理</w:t>
+            </w:r>
+          </w:p>
+        </w:tc>
+        <w:tc>
+          <w:tcPr>
+            <w:tcW w:type="dxa" w:w="2880"/>
+          </w:tcPr>
+          <w:p>
+            <w:r>
+              <w:t>Three Lines Model</w:t>
+            </w:r>
+          </w:p>
+        </w:tc>
+        <w:tc>
+          <w:tcPr>
+            <w:tcW w:type="dxa" w:w="2880"/>
+          </w:tcPr>
+          <w:p>
+            <w:r>
+              <w:t>3つの防衛線（同じ概念）</w:t>
+            </w:r>
+          </w:p>
+        </w:tc>
+      </w:tr>
+    </w:tbl>
+    <w:p/>
+    <w:p>
+      <w:r>
+        <w:t>→ 柱の構成はほぼ同じ。名前が違うだけ。</w:t>
+      </w:r>
+    </w:p>
     <w:sectPr>
       <w:pgSz w:w="12240" w:h="15840"/>
       <w:pgMar w:top="1440" w:right="1800" w:bottom="1440" w:left="1800" w:header="720" w:footer="720" w:gutter="0"/>

</xml_diff>